<commit_message>
Update the built-in certificate template and tighten the standards and date form.
Co-authored-by: Cursor <cursoragent@cursor.com>
</commit_message>
<xml_diff>
--- a/内审员证书.docx
+++ b/内审员证书.docx
@@ -1,6 +1,6 @@
 
 <file path=word/document.xml><?xml version="1.0" encoding="utf-8"?>
-<w:document xmlns:wpc="http://schemas.microsoft.com/office/word/2010/wordprocessingCanvas" xmlns:mc="http://schemas.openxmlformats.org/markup-compatibility/2006" xmlns:o="urn:schemas-microsoft-com:office:office" xmlns:r="http://schemas.openxmlformats.org/officeDocument/2006/relationships" xmlns:m="http://schemas.openxmlformats.org/officeDocument/2006/math" xmlns:v="urn:schemas-microsoft-com:vml" xmlns:wp14="http://schemas.microsoft.com/office/word/2010/wordprocessingDrawing" xmlns:wp="http://schemas.openxmlformats.org/drawingml/2006/wordprocessingDrawing" xmlns:w="http://schemas.openxmlformats.org/wordprocessingml/2006/main" xmlns:w14="http://schemas.microsoft.com/office/word/2010/wordml" xmlns:w10="urn:schemas-microsoft-com:office:word" xmlns:w15="http://schemas.microsoft.com/office/word/2012/wordml" xmlns:wpg="http://schemas.microsoft.com/office/word/2010/wordprocessingGroup" xmlns:wpi="http://schemas.microsoft.com/office/word/2010/wordprocessingInk" xmlns:wne="http://schemas.microsoft.com/office/word/2006/wordml" xmlns:wps="http://schemas.microsoft.com/office/word/2010/wordprocessingShape" xmlns:wpsCustomData="http://www.wps.cn/officeDocument/2013/wpsCustomData" mc:Ignorable="w14 w15 wp14">
+<w:document xmlns:wpc="http://schemas.microsoft.com/office/word/2010/wordprocessingCanvas" xmlns:cx="http://schemas.microsoft.com/office/drawing/2014/chartex" xmlns:cx1="http://schemas.microsoft.com/office/drawing/2015/9/8/chartex" xmlns:cx2="http://schemas.microsoft.com/office/drawing/2015/10/21/chartex" xmlns:cx3="http://schemas.microsoft.com/office/drawing/2016/5/9/chartex" xmlns:cx4="http://schemas.microsoft.com/office/drawing/2016/5/10/chartex" xmlns:cx5="http://schemas.microsoft.com/office/drawing/2016/5/11/chartex" xmlns:cx6="http://schemas.microsoft.com/office/drawing/2016/5/12/chartex" xmlns:cx7="http://schemas.microsoft.com/office/drawing/2016/5/13/chartex" xmlns:cx8="http://schemas.microsoft.com/office/drawing/2016/5/14/chartex" xmlns:mc="http://schemas.openxmlformats.org/markup-compatibility/2006" xmlns:o="urn:schemas-microsoft-com:office:office" xmlns:r="http://schemas.openxmlformats.org/officeDocument/2006/relationships" xmlns:m="http://schemas.openxmlformats.org/officeDocument/2006/math" xmlns:v="urn:schemas-microsoft-com:vml" xmlns:wp14="http://schemas.microsoft.com/office/word/2010/wordprocessingDrawing" xmlns:wp="http://schemas.openxmlformats.org/drawingml/2006/wordprocessingDrawing" xmlns:w="http://schemas.openxmlformats.org/wordprocessingml/2006/main" xmlns:w14="http://schemas.microsoft.com/office/word/2010/wordml" xmlns:w10="urn:schemas-microsoft-com:office:word" xmlns:w15="http://schemas.microsoft.com/office/word/2012/wordml" xmlns:wpg="http://schemas.microsoft.com/office/word/2010/wordprocessingGroup" xmlns:wpi="http://schemas.microsoft.com/office/word/2010/wordprocessingInk" xmlns:wne="http://schemas.microsoft.com/office/word/2006/wordml" xmlns:wps="http://schemas.microsoft.com/office/word/2010/wordprocessingShape" xmlns:wpsCustomData="http://www.wps.cn/officeDocument/2013/wpsCustomData" mc:Ignorable="w14 w15 wp14">
   <w:background w:color="FFFFFF"/>
   <w:body>
     <w:p>
@@ -14,8 +14,6 @@
           <w:szCs w:val="28"/>
         </w:rPr>
       </w:pPr>
-      <w:bookmarkStart w:id="0" w:name="_GoBack"/>
-      <w:bookmarkEnd w:id="0"/>
     </w:p>
     <w:p>
       <w:pPr>
@@ -305,8 +303,29 @@
           <w:color w:val="000000"/>
           <w:sz w:val="32"/>
           <w:szCs w:val="32"/>
-        </w:rPr>
-        <w:t>培训班的学习，考试合格，特发此证。</w:t>
+          <w:lang w:val="en-US" w:eastAsia="zh-CN"/>
+        </w:rPr>
+        <w:t>内审员</w:t>
+      </w:r>
+      <w:r>
+        <w:rPr>
+          <w:rFonts w:hint="eastAsia" w:ascii="华文楷体" w:hAnsi="华文楷体" w:eastAsia="华文楷体"/>
+          <w:color w:val="000000"/>
+          <w:sz w:val="32"/>
+          <w:szCs w:val="32"/>
+        </w:rPr>
+        <w:t>培训班</w:t>
+      </w:r>
+      <w:bookmarkStart w:id="0" w:name="_GoBack"/>
+      <w:bookmarkEnd w:id="0"/>
+      <w:r>
+        <w:rPr>
+          <w:rFonts w:hint="eastAsia" w:ascii="华文楷体" w:hAnsi="华文楷体" w:eastAsia="华文楷体"/>
+          <w:color w:val="000000"/>
+          <w:sz w:val="32"/>
+          <w:szCs w:val="32"/>
+        </w:rPr>
+        <w:t>的学习，考试合格，特发此证。</w:t>
       </w:r>
     </w:p>
     <w:p>

</xml_diff>